<commit_message>
Meetings 5-8: streamline tools and reframe Meeting 8 as proficiency calibration
- M5: drop Deconstructing (moves to M6); keep REAL + the EMS Essential Standards
  Organizer, so selection is one core activity instead of three.
- M6: EMS Learning Target Breakdown is now the primary tool; Deconstructing an
  Essential Standard kept as an optional supplement; cut the Standards Unpacking
  Template (redundant).
- M8: reframed from a buffer into a working calibration meeting — teams write
  proficiency anchors, compare, and refine success criteria. New EMS Proficiency
  Anchors worksheet. Makes explicit that true scoring calibration comes later,
  after students take the common assessment. New M8 agenda + directions.
- Add Meetings 5-8 roadmap one-pager (public/handouts).

Co-Authored-By: Claude Opus 4.8 <noreply@anthropic.com>
</commit_message>
<xml_diff>
--- a/public/agendas/ems-meeting-8-agenda.docx
+++ b/public/agendas/ems-meeting-8-agenda.docx
@@ -4,13 +4,12 @@
   <w:body>
     <w:p>
       <w:pPr>
-        <w:spacing w:after="30"/>
-        <w:jc w:val="center"/>
+        <w:spacing w:after="40"/>
       </w:pPr>
       <w:r>
         <w:drawing>
           <wp:inline distT="0" distB="0" distL="0" distR="0">
-            <wp:extent cx="571500" cy="371475"/>
+            <wp:extent cx="438150" cy="438150"/>
             <wp:effectExtent t="0" r="0" b="0" l="0"/>
             <wp:docPr id="1" name="" descr="" title=""/>
             <wp:cNvGraphicFramePr>
@@ -35,7 +34,7 @@
                   <pic:spPr bwMode="auto">
                     <a:xfrm>
                       <a:off x="0" y="0"/>
-                      <a:ext cx="571500" cy="371475"/>
+                      <a:ext cx="438150" cy="438150"/>
                     </a:xfrm>
                     <a:prstGeom prst="rect">
                       <a:avLst/>
@@ -50,8 +49,7 @@
     </w:p>
     <w:p>
       <w:pPr>
-        <w:spacing w:after="30"/>
-        <w:jc w:val="center"/>
+        <w:spacing w:after="20"/>
       </w:pPr>
       <w:r>
         <w:rPr>
@@ -59,8 +57,9 @@
           <w:b/>
           <w:bCs/>
           <w:color w:val="9B2C2C"/>
-          <w:sz w:val="15"/>
-          <w:szCs w:val="15"/>
+          <w:spacing w:val="8"/>
+          <w:sz w:val="16"/>
+          <w:szCs w:val="16"/>
         </w:rPr>
         <w:t xml:space="preserve">ELSINORE MIDDLE SCHOOL · MEETING 8 OF 18 · AGENDA</w:t>
       </w:r>
@@ -68,7 +67,6 @@
     <w:p>
       <w:pPr>
         <w:spacing w:after="20"/>
-        <w:jc w:val="center"/>
       </w:pPr>
       <w:r>
         <w:rPr>
@@ -79,29 +77,30 @@
           <w:sz w:val="40"/>
           <w:szCs w:val="40"/>
         </w:rPr>
-        <w:t xml:space="preserve">Buffer and Calibration</w:t>
+        <w:t xml:space="preserve">Calibration: Defining Proficiency Together</w:t>
       </w:r>
     </w:p>
     <w:p>
       <w:pPr>
-        <w:spacing w:after="170"/>
-        <w:jc w:val="center"/>
+        <w:pBdr>
+          <w:bottom w:val="single" w:color="9B2C2C" w:sz="14" w:space="6"/>
+        </w:pBdr>
+        <w:spacing w:after="120"/>
       </w:pPr>
       <w:r>
         <w:rPr>
           <w:rFonts w:ascii="Calibri" w:cs="Calibri" w:eastAsia="Calibri" w:hAnsi="Calibri"/>
-          <w:i/>
-          <w:iCs/>
           <w:color w:val="64748B"/>
-          <w:sz w:val="23"/>
-          <w:szCs w:val="23"/>
+          <w:sz w:val="22"/>
+          <w:szCs w:val="22"/>
         </w:rPr>
-        <w:t xml:space="preserve">Reinforcement before assessment design.</w:t>
+        <w:t xml:space="preserve">Building a shared picture of proficiency — before student work exists.</w:t>
       </w:r>
     </w:p>
     <w:p>
       <w:pPr>
-        <w:spacing w:after="90" w:before="220"/>
+        <w:keepNext/>
+        <w:spacing w:after="80" w:before="200"/>
       </w:pPr>
       <w:r>
         <w:rPr>
@@ -109,15 +108,15 @@
           <w:b/>
           <w:bCs/>
           <w:color w:val="9B2C2C"/>
-          <w:sz w:val="26"/>
-          <w:szCs w:val="26"/>
+          <w:sz w:val="25"/>
+          <w:szCs w:val="25"/>
         </w:rPr>
         <w:t xml:space="preserve">Why this meeting matters</w:t>
       </w:r>
     </w:p>
     <w:p>
       <w:pPr>
-        <w:spacing w:after="90"/>
+        <w:spacing w:after="120"/>
       </w:pPr>
       <w:r>
         <w:rPr>
@@ -126,24 +125,38 @@
           <w:sz w:val="22"/>
           <w:szCs w:val="22"/>
         </w:rPr>
-        <w:t xml:space="preserve">This is the second intentional buffer. Teams may want to rush to creating a quiz. This meeting slows them down so the assessment is aligned to the learning, not just the unit.</w:t>
+        <w:t xml:space="preserve">Teams often think they agree on a standard until they try to describe exactly what proficient work looks like. This meeting builds that shared picture before any assessment is written — so the common assessment is designed around one agreed definition of proficiency, not five.</w:t>
+      </w:r>
+    </w:p>
+    <w:p>
+      <w:pPr>
+        <w:spacing w:after="120"/>
+      </w:pPr>
+      <w:r>
+        <w:rPr>
+          <w:rFonts w:ascii="Calibri" w:cs="Calibri" w:eastAsia="Calibri" w:hAnsi="Calibri"/>
+          <w:color w:val="1F2933"/>
+          <w:sz w:val="22"/>
+          <w:szCs w:val="22"/>
+        </w:rPr>
+        <w:t xml:space="preserve">You can't truly calibrate scoring until students have produced work, so that comes later — after the first common assessment. What you can do now: each teacher writes a proficient and a not-yet anchor for a key target, the team compares them, surfaces the disagreements, and refines the success criteria. The disagreements are the point.</w:t>
       </w:r>
     </w:p>
     <w:tbl>
       <w:tblPr>
         <w:tblW w:type="dxa" w:w="9360"/>
         <w:tblBorders>
-          <w:top w:val="single" w:color="auto" w:sz="4"/>
-          <w:left w:val="single" w:color="auto" w:sz="4"/>
-          <w:bottom w:val="single" w:color="auto" w:sz="4"/>
-          <w:right w:val="single" w:color="auto" w:sz="4"/>
-          <w:insideH w:val="single" w:color="auto" w:sz="4"/>
-          <w:insideV w:val="single" w:color="auto" w:sz="4"/>
+          <w:top w:val="single" w:color="E5E7EB" w:sz="4"/>
+          <w:left w:val="single" w:color="E5E7EB" w:sz="4"/>
+          <w:bottom w:val="single" w:color="E5E7EB" w:sz="4"/>
+          <w:right w:val="single" w:color="E5E7EB" w:sz="4"/>
+          <w:insideH w:val="single" w:color="E5E7EB" w:sz="4"/>
+          <w:insideV w:val="single" w:color="E5E7EB" w:sz="4"/>
         </w:tblBorders>
       </w:tblPr>
       <w:tblGrid>
-        <w:gridCol w:w="1872"/>
-        <w:gridCol w:w="7488"/>
+        <w:gridCol w:w="2059"/>
+        <w:gridCol w:w="7301"/>
       </w:tblGrid>
       <w:tr>
         <w:trPr>
@@ -151,19 +164,13 @@
         </w:trPr>
         <w:tc>
           <w:tcPr>
-            <w:tcW w:type="dxa" w:w="1872"/>
-            <w:tcBorders>
-              <w:top w:val="single" w:color="E2E2E2" w:sz="4"/>
-              <w:left w:val="single" w:color="E2E2E2" w:sz="4"/>
-              <w:bottom w:val="single" w:color="E2E2E2" w:sz="4"/>
-              <w:right w:val="single" w:color="E2E2E2" w:sz="4"/>
-            </w:tcBorders>
+            <w:tcW w:type="dxa" w:w="2059"/>
             <w:shd w:fill="9B2C2C" w:color="auto" w:val="clear"/>
             <w:tcMar>
-              <w:top w:type="dxa" w:w="60"/>
-              <w:left w:type="dxa" w:w="100"/>
-              <w:bottom w:type="dxa" w:w="60"/>
-              <w:right w:type="dxa" w:w="100"/>
+              <w:top w:type="dxa" w:w="90"/>
+              <w:left w:type="dxa" w:w="110"/>
+              <w:bottom w:type="dxa" w:w="90"/>
+              <w:right w:type="dxa" w:w="110"/>
             </w:tcMar>
           </w:tcPr>
           <w:p>
@@ -182,19 +189,13 @@
         </w:tc>
         <w:tc>
           <w:tcPr>
-            <w:tcW w:type="dxa" w:w="7488"/>
-            <w:tcBorders>
-              <w:top w:val="single" w:color="E2E2E2" w:sz="4"/>
-              <w:left w:val="single" w:color="E2E2E2" w:sz="4"/>
-              <w:bottom w:val="single" w:color="E2E2E2" w:sz="4"/>
-              <w:right w:val="single" w:color="E2E2E2" w:sz="4"/>
-            </w:tcBorders>
+            <w:tcW w:type="dxa" w:w="7301"/>
             <w:shd w:fill="9B2C2C" w:color="auto" w:val="clear"/>
             <w:tcMar>
-              <w:top w:type="dxa" w:w="60"/>
-              <w:left w:type="dxa" w:w="100"/>
-              <w:bottom w:type="dxa" w:w="60"/>
-              <w:right w:type="dxa" w:w="100"/>
+              <w:top w:type="dxa" w:w="90"/>
+              <w:left w:type="dxa" w:w="110"/>
+              <w:bottom w:type="dxa" w:w="90"/>
+              <w:right w:type="dxa" w:w="110"/>
             </w:tcMar>
           </w:tcPr>
           <w:p>
@@ -214,34 +215,32 @@
       </w:tr>
       <w:tr>
         <w:trPr>
-          <w:trHeight w:val="560" w:hRule="atLeast"/>
+          <w:cantSplit/>
         </w:trPr>
         <w:tc>
           <w:tcPr>
-            <w:tcW w:type="dxa" w:w="1872"/>
-            <w:tcBorders>
-              <w:top w:val="single" w:color="E2E2E2" w:sz="4"/>
-              <w:left w:val="single" w:color="E2E2E2" w:sz="4"/>
-              <w:bottom w:val="single" w:color="E2E2E2" w:sz="4"/>
-              <w:right w:val="single" w:color="E2E2E2" w:sz="4"/>
-            </w:tcBorders>
+            <w:tcW w:type="dxa" w:w="2059"/>
             <w:shd w:fill="F7ECEC" w:color="auto" w:val="clear"/>
             <w:tcMar>
-              <w:top w:type="dxa" w:w="60"/>
-              <w:left w:type="dxa" w:w="100"/>
-              <w:bottom w:type="dxa" w:w="60"/>
-              <w:right w:type="dxa" w:w="100"/>
-            </w:tcMar>
-          </w:tcPr>
-          <w:p>
+              <w:top w:type="dxa" w:w="90"/>
+              <w:left w:type="dxa" w:w="110"/>
+              <w:bottom w:type="dxa" w:w="90"/>
+              <w:right w:type="dxa" w:w="110"/>
+            </w:tcMar>
+            <w:vAlign w:val="top"/>
+          </w:tcPr>
+          <w:p>
+            <w:pPr>
+              <w:spacing w:after="20"/>
+            </w:pPr>
             <w:r>
               <w:rPr>
                 <w:rFonts w:ascii="Calibri" w:cs="Calibri" w:eastAsia="Calibri" w:hAnsi="Calibri"/>
                 <w:b/>
                 <w:bCs/>
-                <w:color w:val="7A2626"/>
-                <w:sz w:val="22"/>
-                <w:szCs w:val="22"/>
+                <w:color w:val="1F2933"/>
+                <w:sz w:val="21"/>
+                <w:szCs w:val="21"/>
               </w:rPr>
               <w:t xml:space="preserve">Focus</w:t>
             </w:r>
@@ -249,27 +248,27 @@
         </w:tc>
         <w:tc>
           <w:tcPr>
-            <w:tcW w:type="dxa" w:w="7488"/>
-            <w:tcBorders>
-              <w:top w:val="single" w:color="E2E2E2" w:sz="4"/>
-              <w:left w:val="single" w:color="E2E2E2" w:sz="4"/>
-              <w:bottom w:val="single" w:color="E2E2E2" w:sz="4"/>
-              <w:right w:val="single" w:color="E2E2E2" w:sz="4"/>
-            </w:tcBorders>
-            <w:tcMar>
-              <w:top w:type="dxa" w:w="60"/>
-              <w:left w:type="dxa" w:w="100"/>
-              <w:bottom w:type="dxa" w:w="60"/>
-              <w:right w:type="dxa" w:w="100"/>
-            </w:tcMar>
-          </w:tcPr>
-          <w:p>
-            <w:r>
-              <w:rPr>
-                <w:rFonts w:ascii="Calibri" w:cs="Calibri" w:eastAsia="Calibri" w:hAnsi="Calibri"/>
+            <w:tcW w:type="dxa" w:w="7301"/>
+            <w:tcMar>
+              <w:top w:type="dxa" w:w="90"/>
+              <w:left w:type="dxa" w:w="110"/>
+              <w:bottom w:type="dxa" w:w="90"/>
+              <w:right w:type="dxa" w:w="110"/>
+            </w:tcMar>
+            <w:vAlign w:val="top"/>
+          </w:tcPr>
+          <w:p>
+            <w:pPr>
+              <w:spacing w:after="20"/>
+            </w:pPr>
+            <w:r>
+              <w:rPr>
+                <w:rFonts w:ascii="Calibri" w:cs="Calibri" w:eastAsia="Calibri" w:hAnsi="Calibri"/>
+                <w:b w:val="false"/>
+                <w:bCs w:val="false"/>
                 <w:color w:val="1F2933"/>
-                <w:sz w:val="22"/>
-                <w:szCs w:val="22"/>
+                <w:sz w:val="21"/>
+                <w:szCs w:val="21"/>
               </w:rPr>
               <w:t xml:space="preserve">Are we truly clear on what students must learn and what proficiency looks like?</w:t>
             </w:r>
@@ -278,34 +277,32 @@
       </w:tr>
       <w:tr>
         <w:trPr>
-          <w:trHeight w:val="560" w:hRule="atLeast"/>
+          <w:cantSplit/>
         </w:trPr>
         <w:tc>
           <w:tcPr>
-            <w:tcW w:type="dxa" w:w="1872"/>
-            <w:tcBorders>
-              <w:top w:val="single" w:color="E2E2E2" w:sz="4"/>
-              <w:left w:val="single" w:color="E2E2E2" w:sz="4"/>
-              <w:bottom w:val="single" w:color="E2E2E2" w:sz="4"/>
-              <w:right w:val="single" w:color="E2E2E2" w:sz="4"/>
-            </w:tcBorders>
+            <w:tcW w:type="dxa" w:w="2059"/>
             <w:shd w:fill="F7ECEC" w:color="auto" w:val="clear"/>
             <w:tcMar>
-              <w:top w:type="dxa" w:w="60"/>
-              <w:left w:type="dxa" w:w="100"/>
-              <w:bottom w:type="dxa" w:w="60"/>
-              <w:right w:type="dxa" w:w="100"/>
-            </w:tcMar>
-          </w:tcPr>
-          <w:p>
+              <w:top w:type="dxa" w:w="90"/>
+              <w:left w:type="dxa" w:w="110"/>
+              <w:bottom w:type="dxa" w:w="90"/>
+              <w:right w:type="dxa" w:w="110"/>
+            </w:tcMar>
+            <w:vAlign w:val="top"/>
+          </w:tcPr>
+          <w:p>
+            <w:pPr>
+              <w:spacing w:after="20"/>
+            </w:pPr>
             <w:r>
               <w:rPr>
                 <w:rFonts w:ascii="Calibri" w:cs="Calibri" w:eastAsia="Calibri" w:hAnsi="Calibri"/>
                 <w:b/>
                 <w:bCs/>
-                <w:color w:val="7A2626"/>
-                <w:sz w:val="22"/>
-                <w:szCs w:val="22"/>
+                <w:color w:val="1F2933"/>
+                <w:sz w:val="21"/>
+                <w:szCs w:val="21"/>
               </w:rPr>
               <w:t xml:space="preserve">Leave with</w:t>
             </w:r>
@@ -313,29 +310,29 @@
         </w:tc>
         <w:tc>
           <w:tcPr>
-            <w:tcW w:type="dxa" w:w="7488"/>
-            <w:tcBorders>
-              <w:top w:val="single" w:color="E2E2E2" w:sz="4"/>
-              <w:left w:val="single" w:color="E2E2E2" w:sz="4"/>
-              <w:bottom w:val="single" w:color="E2E2E2" w:sz="4"/>
-              <w:right w:val="single" w:color="E2E2E2" w:sz="4"/>
-            </w:tcBorders>
-            <w:tcMar>
-              <w:top w:type="dxa" w:w="60"/>
-              <w:left w:type="dxa" w:w="100"/>
-              <w:bottom w:type="dxa" w:w="60"/>
-              <w:right w:type="dxa" w:w="100"/>
-            </w:tcMar>
-          </w:tcPr>
-          <w:p>
-            <w:r>
-              <w:rPr>
-                <w:rFonts w:ascii="Calibri" w:cs="Calibri" w:eastAsia="Calibri" w:hAnsi="Calibri"/>
+            <w:tcW w:type="dxa" w:w="7301"/>
+            <w:tcMar>
+              <w:top w:type="dxa" w:w="90"/>
+              <w:left w:type="dxa" w:w="110"/>
+              <w:bottom w:type="dxa" w:w="90"/>
+              <w:right w:type="dxa" w:w="110"/>
+            </w:tcMar>
+            <w:vAlign w:val="top"/>
+          </w:tcPr>
+          <w:p>
+            <w:pPr>
+              <w:spacing w:after="20"/>
+            </w:pPr>
+            <w:r>
+              <w:rPr>
+                <w:rFonts w:ascii="Calibri" w:cs="Calibri" w:eastAsia="Calibri" w:hAnsi="Calibri"/>
+                <w:b w:val="false"/>
+                <w:bCs w:val="false"/>
                 <w:color w:val="1F2933"/>
-                <w:sz w:val="22"/>
-                <w:szCs w:val="22"/>
-              </w:rPr>
-              <w:t xml:space="preserve">Finalized learning targets and success criteria.</w:t>
+                <w:sz w:val="21"/>
+                <w:szCs w:val="21"/>
+              </w:rPr>
+              <w:t xml:space="preserve">Agreed proficiency anchors and refined success criteria for each learning target.</w:t>
             </w:r>
           </w:p>
         </w:tc>
@@ -343,7 +340,8 @@
     </w:tbl>
     <w:p>
       <w:pPr>
-        <w:spacing w:after="90" w:before="220"/>
+        <w:keepNext/>
+        <w:spacing w:after="80" w:before="200"/>
       </w:pPr>
       <w:r>
         <w:rPr>
@@ -351,8 +349,8 @@
           <w:b/>
           <w:bCs/>
           <w:color w:val="9B2C2C"/>
-          <w:sz w:val="26"/>
-          <w:szCs w:val="26"/>
+          <w:sz w:val="25"/>
+          <w:szCs w:val="25"/>
         </w:rPr>
         <w:t xml:space="preserve">Agenda — step by step</w:t>
       </w:r>
@@ -361,12 +359,12 @@
       <w:tblPr>
         <w:tblW w:type="dxa" w:w="9360"/>
         <w:tblBorders>
-          <w:top w:val="single" w:color="auto" w:sz="4"/>
-          <w:left w:val="single" w:color="auto" w:sz="4"/>
-          <w:bottom w:val="single" w:color="auto" w:sz="4"/>
-          <w:right w:val="single" w:color="auto" w:sz="4"/>
-          <w:insideH w:val="single" w:color="auto" w:sz="4"/>
-          <w:insideV w:val="single" w:color="auto" w:sz="4"/>
+          <w:top w:val="single" w:color="E5E7EB" w:sz="4"/>
+          <w:left w:val="single" w:color="E5E7EB" w:sz="4"/>
+          <w:bottom w:val="single" w:color="E5E7EB" w:sz="4"/>
+          <w:right w:val="single" w:color="E5E7EB" w:sz="4"/>
+          <w:insideH w:val="single" w:color="E5E7EB" w:sz="4"/>
+          <w:insideV w:val="single" w:color="E5E7EB" w:sz="4"/>
         </w:tblBorders>
       </w:tblPr>
       <w:tblGrid>
@@ -380,18 +378,12 @@
         <w:tc>
           <w:tcPr>
             <w:tcW w:type="dxa" w:w="1404"/>
-            <w:tcBorders>
-              <w:top w:val="single" w:color="E2E2E2" w:sz="4"/>
-              <w:left w:val="single" w:color="E2E2E2" w:sz="4"/>
-              <w:bottom w:val="single" w:color="E2E2E2" w:sz="4"/>
-              <w:right w:val="single" w:color="E2E2E2" w:sz="4"/>
-            </w:tcBorders>
             <w:shd w:fill="9B2C2C" w:color="auto" w:val="clear"/>
             <w:tcMar>
-              <w:top w:type="dxa" w:w="60"/>
-              <w:left w:type="dxa" w:w="100"/>
-              <w:bottom w:type="dxa" w:w="60"/>
-              <w:right w:type="dxa" w:w="100"/>
+              <w:top w:type="dxa" w:w="90"/>
+              <w:left w:type="dxa" w:w="110"/>
+              <w:bottom w:type="dxa" w:w="90"/>
+              <w:right w:type="dxa" w:w="110"/>
             </w:tcMar>
           </w:tcPr>
           <w:p>
@@ -411,18 +403,12 @@
         <w:tc>
           <w:tcPr>
             <w:tcW w:type="dxa" w:w="7956"/>
-            <w:tcBorders>
-              <w:top w:val="single" w:color="E2E2E2" w:sz="4"/>
-              <w:left w:val="single" w:color="E2E2E2" w:sz="4"/>
-              <w:bottom w:val="single" w:color="E2E2E2" w:sz="4"/>
-              <w:right w:val="single" w:color="E2E2E2" w:sz="4"/>
-            </w:tcBorders>
             <w:shd w:fill="9B2C2C" w:color="auto" w:val="clear"/>
             <w:tcMar>
-              <w:top w:type="dxa" w:w="60"/>
-              <w:left w:type="dxa" w:w="100"/>
-              <w:bottom w:type="dxa" w:w="60"/>
-              <w:right w:type="dxa" w:w="100"/>
+              <w:top w:type="dxa" w:w="90"/>
+              <w:left w:type="dxa" w:w="110"/>
+              <w:bottom w:type="dxa" w:w="90"/>
+              <w:right w:type="dxa" w:w="110"/>
             </w:tcMar>
           </w:tcPr>
           <w:p>
@@ -442,320 +428,310 @@
       </w:tr>
       <w:tr>
         <w:trPr>
-          <w:trHeight w:val="560" w:hRule="atLeast"/>
+          <w:cantSplit/>
         </w:trPr>
         <w:tc>
           <w:tcPr>
             <w:tcW w:type="dxa" w:w="1404"/>
-            <w:tcBorders>
-              <w:top w:val="single" w:color="E2E2E2" w:sz="4"/>
-              <w:left w:val="single" w:color="E2E2E2" w:sz="4"/>
-              <w:bottom w:val="single" w:color="E2E2E2" w:sz="4"/>
-              <w:right w:val="single" w:color="E2E2E2" w:sz="4"/>
-            </w:tcBorders>
             <w:shd w:fill="F7ECEC" w:color="auto" w:val="clear"/>
             <w:tcMar>
-              <w:top w:type="dxa" w:w="60"/>
-              <w:left w:type="dxa" w:w="100"/>
-              <w:bottom w:type="dxa" w:w="60"/>
-              <w:right w:type="dxa" w:w="100"/>
-            </w:tcMar>
-          </w:tcPr>
-          <w:p>
+              <w:top w:type="dxa" w:w="90"/>
+              <w:left w:type="dxa" w:w="110"/>
+              <w:bottom w:type="dxa" w:w="90"/>
+              <w:right w:type="dxa" w:w="110"/>
+            </w:tcMar>
+            <w:vAlign w:val="top"/>
+          </w:tcPr>
+          <w:p>
+            <w:pPr>
+              <w:spacing w:after="20"/>
+            </w:pPr>
             <w:r>
               <w:rPr>
                 <w:rFonts w:ascii="Calibri" w:cs="Calibri" w:eastAsia="Calibri" w:hAnsi="Calibri"/>
                 <w:b/>
                 <w:bCs/>
-                <w:color w:val="7A2626"/>
-                <w:sz w:val="22"/>
-                <w:szCs w:val="22"/>
-              </w:rPr>
-              <w:t xml:space="preserve">0–10 min</w:t>
+                <w:color w:val="1F2933"/>
+                <w:sz w:val="21"/>
+                <w:szCs w:val="21"/>
+              </w:rPr>
+              <w:t xml:space="preserve">0–5 min</w:t>
             </w:r>
           </w:p>
         </w:tc>
         <w:tc>
           <w:tcPr>
             <w:tcW w:type="dxa" w:w="7956"/>
-            <w:tcBorders>
-              <w:top w:val="single" w:color="E2E2E2" w:sz="4"/>
-              <w:left w:val="single" w:color="E2E2E2" w:sz="4"/>
-              <w:bottom w:val="single" w:color="E2E2E2" w:sz="4"/>
-              <w:right w:val="single" w:color="E2E2E2" w:sz="4"/>
-            </w:tcBorders>
-            <w:tcMar>
-              <w:top w:type="dxa" w:w="60"/>
-              <w:left w:type="dxa" w:w="100"/>
-              <w:bottom w:type="dxa" w:w="60"/>
-              <w:right w:type="dxa" w:w="100"/>
-            </w:tcMar>
-          </w:tcPr>
-          <w:p>
-            <w:r>
-              <w:rPr>
-                <w:rFonts w:ascii="Calibri" w:cs="Calibri" w:eastAsia="Calibri" w:hAnsi="Calibri"/>
+            <w:tcMar>
+              <w:top w:type="dxa" w:w="90"/>
+              <w:left w:type="dxa" w:w="110"/>
+              <w:bottom w:type="dxa" w:w="90"/>
+              <w:right w:type="dxa" w:w="110"/>
+            </w:tcMar>
+            <w:vAlign w:val="top"/>
+          </w:tcPr>
+          <w:p>
+            <w:pPr>
+              <w:spacing w:after="20"/>
+            </w:pPr>
+            <w:r>
+              <w:rPr>
+                <w:rFonts w:ascii="Calibri" w:cs="Calibri" w:eastAsia="Calibri" w:hAnsi="Calibri"/>
+                <w:b w:val="false"/>
+                <w:bCs w:val="false"/>
                 <w:color w:val="1F2933"/>
-                <w:sz w:val="22"/>
-                <w:szCs w:val="22"/>
-              </w:rPr>
-              <w:t xml:space="preserve">Review norms and roles. Confirm who holds each role today and re-read your team norms together. Review the essential standard, targets, and success criteria.</w:t>
+                <w:sz w:val="21"/>
+                <w:szCs w:val="21"/>
+              </w:rPr>
+              <w:t xml:space="preserve">Review norms and roles. Confirm who holds each role today and re-read your norms. Revisit your essential standard, learning targets, and success criteria.</w:t>
             </w:r>
           </w:p>
         </w:tc>
       </w:tr>
       <w:tr>
         <w:trPr>
-          <w:trHeight w:val="560" w:hRule="atLeast"/>
+          <w:cantSplit/>
         </w:trPr>
         <w:tc>
           <w:tcPr>
             <w:tcW w:type="dxa" w:w="1404"/>
-            <w:tcBorders>
-              <w:top w:val="single" w:color="E2E2E2" w:sz="4"/>
-              <w:left w:val="single" w:color="E2E2E2" w:sz="4"/>
-              <w:bottom w:val="single" w:color="E2E2E2" w:sz="4"/>
-              <w:right w:val="single" w:color="E2E2E2" w:sz="4"/>
-            </w:tcBorders>
             <w:shd w:fill="F7ECEC" w:color="auto" w:val="clear"/>
             <w:tcMar>
-              <w:top w:type="dxa" w:w="60"/>
-              <w:left w:type="dxa" w:w="100"/>
-              <w:bottom w:type="dxa" w:w="60"/>
-              <w:right w:type="dxa" w:w="100"/>
-            </w:tcMar>
-          </w:tcPr>
-          <w:p>
+              <w:top w:type="dxa" w:w="90"/>
+              <w:left w:type="dxa" w:w="110"/>
+              <w:bottom w:type="dxa" w:w="90"/>
+              <w:right w:type="dxa" w:w="110"/>
+            </w:tcMar>
+            <w:vAlign w:val="top"/>
+          </w:tcPr>
+          <w:p>
+            <w:pPr>
+              <w:spacing w:after="20"/>
+            </w:pPr>
             <w:r>
               <w:rPr>
                 <w:rFonts w:ascii="Calibri" w:cs="Calibri" w:eastAsia="Calibri" w:hAnsi="Calibri"/>
                 <w:b/>
                 <w:bCs/>
-                <w:color w:val="7A2626"/>
-                <w:sz w:val="22"/>
-                <w:szCs w:val="22"/>
-              </w:rPr>
-              <w:t xml:space="preserve">10–25 min</w:t>
+                <w:color w:val="1F2933"/>
+                <w:sz w:val="21"/>
+                <w:szCs w:val="21"/>
+              </w:rPr>
+              <w:t xml:space="preserve">5–20 min</w:t>
             </w:r>
           </w:p>
         </w:tc>
         <w:tc>
           <w:tcPr>
             <w:tcW w:type="dxa" w:w="7956"/>
-            <w:tcBorders>
-              <w:top w:val="single" w:color="E2E2E2" w:sz="4"/>
-              <w:left w:val="single" w:color="E2E2E2" w:sz="4"/>
-              <w:bottom w:val="single" w:color="E2E2E2" w:sz="4"/>
-              <w:right w:val="single" w:color="E2E2E2" w:sz="4"/>
-            </w:tcBorders>
-            <w:tcMar>
-              <w:top w:type="dxa" w:w="60"/>
-              <w:left w:type="dxa" w:w="100"/>
-              <w:bottom w:type="dxa" w:w="60"/>
-              <w:right w:type="dxa" w:w="100"/>
-            </w:tcMar>
-          </w:tcPr>
-          <w:p>
-            <w:r>
-              <w:rPr>
-                <w:rFonts w:ascii="Calibri" w:cs="Calibri" w:eastAsia="Calibri" w:hAnsi="Calibri"/>
+            <w:tcMar>
+              <w:top w:type="dxa" w:w="90"/>
+              <w:left w:type="dxa" w:w="110"/>
+              <w:bottom w:type="dxa" w:w="90"/>
+              <w:right w:type="dxa" w:w="110"/>
+            </w:tcMar>
+            <w:vAlign w:val="top"/>
+          </w:tcPr>
+          <w:p>
+            <w:pPr>
+              <w:spacing w:after="20"/>
+            </w:pPr>
+            <w:r>
+              <w:rPr>
+                <w:rFonts w:ascii="Calibri" w:cs="Calibri" w:eastAsia="Calibri" w:hAnsi="Calibri"/>
+                <w:b w:val="false"/>
+                <w:bCs w:val="false"/>
                 <w:color w:val="1F2933"/>
-                <w:sz w:val="22"/>
-                <w:szCs w:val="22"/>
-              </w:rPr>
-              <w:t xml:space="preserve">Calibrate. Score a sample question, task, or response together — do you agree?</w:t>
+                <w:sz w:val="21"/>
+                <w:szCs w:val="21"/>
+              </w:rPr>
+              <w:t xml:space="preserve">Write anchors. Each teacher writes what a proficient response to one key learning target looks like — and a not-yet-proficient one. Writing the “proficient” answer forces you to commit to what proficiency actually is.</w:t>
             </w:r>
           </w:p>
         </w:tc>
       </w:tr>
       <w:tr>
         <w:trPr>
-          <w:trHeight w:val="560" w:hRule="atLeast"/>
+          <w:cantSplit/>
         </w:trPr>
         <w:tc>
           <w:tcPr>
             <w:tcW w:type="dxa" w:w="1404"/>
-            <w:tcBorders>
-              <w:top w:val="single" w:color="E2E2E2" w:sz="4"/>
-              <w:left w:val="single" w:color="E2E2E2" w:sz="4"/>
-              <w:bottom w:val="single" w:color="E2E2E2" w:sz="4"/>
-              <w:right w:val="single" w:color="E2E2E2" w:sz="4"/>
-            </w:tcBorders>
             <w:shd w:fill="F7ECEC" w:color="auto" w:val="clear"/>
             <w:tcMar>
-              <w:top w:type="dxa" w:w="60"/>
-              <w:left w:type="dxa" w:w="100"/>
-              <w:bottom w:type="dxa" w:w="60"/>
-              <w:right w:type="dxa" w:w="100"/>
-            </w:tcMar>
-          </w:tcPr>
-          <w:p>
+              <w:top w:type="dxa" w:w="90"/>
+              <w:left w:type="dxa" w:w="110"/>
+              <w:bottom w:type="dxa" w:w="90"/>
+              <w:right w:type="dxa" w:w="110"/>
+            </w:tcMar>
+            <w:vAlign w:val="top"/>
+          </w:tcPr>
+          <w:p>
+            <w:pPr>
+              <w:spacing w:after="20"/>
+            </w:pPr>
             <w:r>
               <w:rPr>
                 <w:rFonts w:ascii="Calibri" w:cs="Calibri" w:eastAsia="Calibri" w:hAnsi="Calibri"/>
                 <w:b/>
                 <w:bCs/>
-                <w:color w:val="7A2626"/>
-                <w:sz w:val="22"/>
-                <w:szCs w:val="22"/>
-              </w:rPr>
-              <w:t xml:space="preserve">25–35 min</w:t>
+                <w:color w:val="1F2933"/>
+                <w:sz w:val="21"/>
+                <w:szCs w:val="21"/>
+              </w:rPr>
+              <w:t xml:space="preserve">20–33 min</w:t>
             </w:r>
           </w:p>
         </w:tc>
         <w:tc>
           <w:tcPr>
             <w:tcW w:type="dxa" w:w="7956"/>
-            <w:tcBorders>
-              <w:top w:val="single" w:color="E2E2E2" w:sz="4"/>
-              <w:left w:val="single" w:color="E2E2E2" w:sz="4"/>
-              <w:bottom w:val="single" w:color="E2E2E2" w:sz="4"/>
-              <w:right w:val="single" w:color="E2E2E2" w:sz="4"/>
-            </w:tcBorders>
-            <w:tcMar>
-              <w:top w:type="dxa" w:w="60"/>
-              <w:left w:type="dxa" w:w="100"/>
-              <w:bottom w:type="dxa" w:w="60"/>
-              <w:right w:type="dxa" w:w="100"/>
-            </w:tcMar>
-          </w:tcPr>
-          <w:p>
-            <w:r>
-              <w:rPr>
-                <w:rFonts w:ascii="Calibri" w:cs="Calibri" w:eastAsia="Calibri" w:hAnsi="Calibri"/>
+            <w:tcMar>
+              <w:top w:type="dxa" w:w="90"/>
+              <w:left w:type="dxa" w:w="110"/>
+              <w:bottom w:type="dxa" w:w="90"/>
+              <w:right w:type="dxa" w:w="110"/>
+            </w:tcMar>
+            <w:vAlign w:val="top"/>
+          </w:tcPr>
+          <w:p>
+            <w:pPr>
+              <w:spacing w:after="20"/>
+            </w:pPr>
+            <w:r>
+              <w:rPr>
+                <w:rFonts w:ascii="Calibri" w:cs="Calibri" w:eastAsia="Calibri" w:hAnsi="Calibri"/>
+                <w:b w:val="false"/>
+                <w:bCs w:val="false"/>
                 <w:color w:val="1F2933"/>
-                <w:sz w:val="22"/>
-                <w:szCs w:val="22"/>
-              </w:rPr>
-              <w:t xml:space="preserve">Surface disagreements. Name any gaps or differences in how you'd score.</w:t>
+                <w:sz w:val="21"/>
+                <w:szCs w:val="21"/>
+              </w:rPr>
+              <w:t xml:space="preserve">Compare and find the line. Put the anchors side by side. Where do you disagree about whether a response is “there yet”? Those disagreements are the work — name them honestly.</w:t>
             </w:r>
           </w:p>
         </w:tc>
       </w:tr>
       <w:tr>
         <w:trPr>
-          <w:trHeight w:val="560" w:hRule="atLeast"/>
+          <w:cantSplit/>
         </w:trPr>
         <w:tc>
           <w:tcPr>
             <w:tcW w:type="dxa" w:w="1404"/>
-            <w:tcBorders>
-              <w:top w:val="single" w:color="E2E2E2" w:sz="4"/>
-              <w:left w:val="single" w:color="E2E2E2" w:sz="4"/>
-              <w:bottom w:val="single" w:color="E2E2E2" w:sz="4"/>
-              <w:right w:val="single" w:color="E2E2E2" w:sz="4"/>
-            </w:tcBorders>
             <w:shd w:fill="F7ECEC" w:color="auto" w:val="clear"/>
             <w:tcMar>
-              <w:top w:type="dxa" w:w="60"/>
-              <w:left w:type="dxa" w:w="100"/>
-              <w:bottom w:type="dxa" w:w="60"/>
-              <w:right w:type="dxa" w:w="100"/>
-            </w:tcMar>
-          </w:tcPr>
-          <w:p>
+              <w:top w:type="dxa" w:w="90"/>
+              <w:left w:type="dxa" w:w="110"/>
+              <w:bottom w:type="dxa" w:w="90"/>
+              <w:right w:type="dxa" w:w="110"/>
+            </w:tcMar>
+            <w:vAlign w:val="top"/>
+          </w:tcPr>
+          <w:p>
+            <w:pPr>
+              <w:spacing w:after="20"/>
+            </w:pPr>
             <w:r>
               <w:rPr>
                 <w:rFonts w:ascii="Calibri" w:cs="Calibri" w:eastAsia="Calibri" w:hAnsi="Calibri"/>
                 <w:b/>
                 <w:bCs/>
-                <w:color w:val="7A2626"/>
-                <w:sz w:val="22"/>
-                <w:szCs w:val="22"/>
-              </w:rPr>
-              <w:t xml:space="preserve">35–43 min</w:t>
+                <w:color w:val="1F2933"/>
+                <w:sz w:val="21"/>
+                <w:szCs w:val="21"/>
+              </w:rPr>
+              <w:t xml:space="preserve">33–42 min</w:t>
             </w:r>
           </w:p>
         </w:tc>
         <w:tc>
           <w:tcPr>
             <w:tcW w:type="dxa" w:w="7956"/>
-            <w:tcBorders>
-              <w:top w:val="single" w:color="E2E2E2" w:sz="4"/>
-              <w:left w:val="single" w:color="E2E2E2" w:sz="4"/>
-              <w:bottom w:val="single" w:color="E2E2E2" w:sz="4"/>
-              <w:right w:val="single" w:color="E2E2E2" w:sz="4"/>
-            </w:tcBorders>
-            <w:tcMar>
-              <w:top w:type="dxa" w:w="60"/>
-              <w:left w:type="dxa" w:w="100"/>
-              <w:bottom w:type="dxa" w:w="60"/>
-              <w:right w:type="dxa" w:w="100"/>
-            </w:tcMar>
-          </w:tcPr>
-          <w:p>
-            <w:r>
-              <w:rPr>
-                <w:rFonts w:ascii="Calibri" w:cs="Calibri" w:eastAsia="Calibri" w:hAnsi="Calibri"/>
+            <w:tcMar>
+              <w:top w:type="dxa" w:w="90"/>
+              <w:left w:type="dxa" w:w="110"/>
+              <w:bottom w:type="dxa" w:w="90"/>
+              <w:right w:type="dxa" w:w="110"/>
+            </w:tcMar>
+            <w:vAlign w:val="top"/>
+          </w:tcPr>
+          <w:p>
+            <w:pPr>
+              <w:spacing w:after="20"/>
+            </w:pPr>
+            <w:r>
+              <w:rPr>
+                <w:rFonts w:ascii="Calibri" w:cs="Calibri" w:eastAsia="Calibri" w:hAnsi="Calibri"/>
+                <w:b w:val="false"/>
+                <w:bCs w:val="false"/>
                 <w:color w:val="1F2933"/>
-                <w:sz w:val="22"/>
-                <w:szCs w:val="22"/>
-              </w:rPr>
-              <w:t xml:space="preserve">Revise. Adjust targets or proficiency criteria as needed.</w:t>
+                <w:sz w:val="21"/>
+                <w:szCs w:val="21"/>
+              </w:rPr>
+              <w:t xml:space="preserve">Refine success criteria. Adjust your success criteria so they capture what the team agreed proficiency means, in specific, observable language.</w:t>
             </w:r>
           </w:p>
         </w:tc>
       </w:tr>
       <w:tr>
         <w:trPr>
-          <w:trHeight w:val="560" w:hRule="atLeast"/>
+          <w:cantSplit/>
         </w:trPr>
         <w:tc>
           <w:tcPr>
             <w:tcW w:type="dxa" w:w="1404"/>
-            <w:tcBorders>
-              <w:top w:val="single" w:color="E2E2E2" w:sz="4"/>
-              <w:left w:val="single" w:color="E2E2E2" w:sz="4"/>
-              <w:bottom w:val="single" w:color="E2E2E2" w:sz="4"/>
-              <w:right w:val="single" w:color="E2E2E2" w:sz="4"/>
-            </w:tcBorders>
             <w:shd w:fill="F7ECEC" w:color="auto" w:val="clear"/>
             <w:tcMar>
-              <w:top w:type="dxa" w:w="60"/>
-              <w:left w:type="dxa" w:w="100"/>
-              <w:bottom w:type="dxa" w:w="60"/>
-              <w:right w:type="dxa" w:w="100"/>
-            </w:tcMar>
-          </w:tcPr>
-          <w:p>
+              <w:top w:type="dxa" w:w="90"/>
+              <w:left w:type="dxa" w:w="110"/>
+              <w:bottom w:type="dxa" w:w="90"/>
+              <w:right w:type="dxa" w:w="110"/>
+            </w:tcMar>
+            <w:vAlign w:val="top"/>
+          </w:tcPr>
+          <w:p>
+            <w:pPr>
+              <w:spacing w:after="20"/>
+            </w:pPr>
             <w:r>
               <w:rPr>
                 <w:rFonts w:ascii="Calibri" w:cs="Calibri" w:eastAsia="Calibri" w:hAnsi="Calibri"/>
                 <w:b/>
                 <w:bCs/>
-                <w:color w:val="7A2626"/>
-                <w:sz w:val="22"/>
-                <w:szCs w:val="22"/>
-              </w:rPr>
-              <w:t xml:space="preserve">43–45 min</w:t>
+                <w:color w:val="1F2933"/>
+                <w:sz w:val="21"/>
+                <w:szCs w:val="21"/>
+              </w:rPr>
+              <w:t xml:space="preserve">42–45 min</w:t>
             </w:r>
           </w:p>
         </w:tc>
         <w:tc>
           <w:tcPr>
             <w:tcW w:type="dxa" w:w="7956"/>
-            <w:tcBorders>
-              <w:top w:val="single" w:color="E2E2E2" w:sz="4"/>
-              <w:left w:val="single" w:color="E2E2E2" w:sz="4"/>
-              <w:bottom w:val="single" w:color="E2E2E2" w:sz="4"/>
-              <w:right w:val="single" w:color="E2E2E2" w:sz="4"/>
-            </w:tcBorders>
-            <w:tcMar>
-              <w:top w:type="dxa" w:w="60"/>
-              <w:left w:type="dxa" w:w="100"/>
-              <w:bottom w:type="dxa" w:w="60"/>
-              <w:right w:type="dxa" w:w="100"/>
-            </w:tcMar>
-          </w:tcPr>
-          <w:p>
-            <w:r>
-              <w:rPr>
-                <w:rFonts w:ascii="Calibri" w:cs="Calibri" w:eastAsia="Calibri" w:hAnsi="Calibri"/>
+            <w:tcMar>
+              <w:top w:type="dxa" w:w="90"/>
+              <w:left w:type="dxa" w:w="110"/>
+              <w:bottom w:type="dxa" w:w="90"/>
+              <w:right w:type="dxa" w:w="110"/>
+            </w:tcMar>
+            <w:vAlign w:val="top"/>
+          </w:tcPr>
+          <w:p>
+            <w:pPr>
+              <w:spacing w:after="20"/>
+            </w:pPr>
+            <w:r>
+              <w:rPr>
+                <w:rFonts w:ascii="Calibri" w:cs="Calibri" w:eastAsia="Calibri" w:hAnsi="Calibri"/>
+                <w:b w:val="false"/>
+                <w:bCs w:val="false"/>
                 <w:color w:val="1F2933"/>
-                <w:sz w:val="22"/>
-                <w:szCs w:val="22"/>
-              </w:rPr>
-              <w:t xml:space="preserve">Confirm readiness. Agree you're ready to design the common assessment.</w:t>
+                <w:sz w:val="21"/>
+                <w:szCs w:val="21"/>
+              </w:rPr>
+              <w:t xml:space="preserve">Preview the real calibration. True scoring calibration comes after students take the common assessment — this shared picture is what you'll calibrate against then.</w:t>
             </w:r>
           </w:p>
         </w:tc>
@@ -763,84 +739,25 @@
     </w:tbl>
     <w:p>
       <w:pPr>
-        <w:spacing w:before="140"/>
+        <w:shd w:fill="F7ECEC" w:color="auto" w:val="clear"/>
+        <w:spacing w:after="120" w:before="120"/>
       </w:pPr>
       <w:r>
         <w:rPr>
           <w:rFonts w:ascii="Calibri" w:cs="Calibri" w:eastAsia="Calibri" w:hAnsi="Calibri"/>
+          <w:color w:val="1F2933"/>
+          <w:sz w:val="21"/>
+          <w:szCs w:val="21"/>
         </w:rPr>
-        <w:t xml:space="preserve"/>
+        <w:t xml:space="preserve">Where we're going next → Meeting 9: Designing the Common Formative Assessment. You'll build the assessment around the proficiency you just defined (PLC Question 2: How will we know they've learned it?).</w:t>
       </w:r>
     </w:p>
-    <w:tbl>
-      <w:tblPr>
-        <w:tblW w:type="dxa" w:w="9360"/>
-        <w:tblBorders>
-          <w:top w:val="single" w:color="auto" w:sz="4"/>
-          <w:left w:val="single" w:color="auto" w:sz="4"/>
-          <w:bottom w:val="single" w:color="auto" w:sz="4"/>
-          <w:right w:val="single" w:color="auto" w:sz="4"/>
-          <w:insideH w:val="single" w:color="auto" w:sz="4"/>
-          <w:insideV w:val="single" w:color="auto" w:sz="4"/>
-        </w:tblBorders>
-      </w:tblPr>
-      <w:tblGrid>
-        <w:gridCol w:w="9360"/>
-      </w:tblGrid>
-      <w:tr>
-        <w:tc>
-          <w:tcPr>
-            <w:tcW w:type="dxa" w:w="9360"/>
-            <w:tcBorders>
-              <w:top w:val="single" w:color="E0A99F" w:sz="8"/>
-              <w:left w:val="single" w:color="E0A99F" w:sz="8"/>
-              <w:bottom w:val="single" w:color="E0A99F" w:sz="8"/>
-              <w:right w:val="single" w:color="E0A99F" w:sz="8"/>
-            </w:tcBorders>
-            <w:shd w:fill="FDF3EF" w:color="auto" w:val="clear"/>
-            <w:tcMar>
-              <w:top w:type="dxa" w:w="120"/>
-              <w:left w:type="dxa" w:w="160"/>
-              <w:bottom w:type="dxa" w:w="120"/>
-              <w:right w:type="dxa" w:w="160"/>
-            </w:tcMar>
-          </w:tcPr>
-          <w:p>
-            <w:pPr>
-              <w:spacing w:after="30"/>
-            </w:pPr>
-            <w:r>
-              <w:rPr>
-                <w:rFonts w:ascii="Calibri" w:cs="Calibri" w:eastAsia="Calibri" w:hAnsi="Calibri"/>
-                <w:b/>
-                <w:bCs/>
-                <w:color w:val="9B2C2C"/>
-                <w:sz w:val="24"/>
-                <w:szCs w:val="24"/>
-              </w:rPr>
-              <w:t xml:space="preserve">Where we're going next → Meeting 9</w:t>
-            </w:r>
-          </w:p>
-          <w:p>
-            <w:r>
-              <w:rPr>
-                <w:rFonts w:ascii="Calibri" w:cs="Calibri" w:eastAsia="Calibri" w:hAnsi="Calibri"/>
-                <w:color w:val="1F2933"/>
-                <w:sz w:val="22"/>
-                <w:szCs w:val="22"/>
-              </w:rPr>
-              <w:t xml:space="preserve">Designing the Common Formative Assessment — PLC Question 2: How will we know if students learned it?</w:t>
-            </w:r>
-          </w:p>
-        </w:tc>
-      </w:tr>
-    </w:tbl>
     <w:p>
       <w:pPr>
         <w:pBdr>
-          <w:top w:val="single" w:color="E2E2E2" w:sz="4" w:space="8"/>
+          <w:top w:val="single" w:color="E5E7EB" w:sz="4" w:space="6"/>
         </w:pBdr>
-        <w:spacing w:before="180"/>
+        <w:spacing w:before="200"/>
       </w:pPr>
       <w:r>
         <w:rPr>
@@ -848,24 +765,20 @@
           <w:i/>
           <w:iCs/>
           <w:color w:val="64748B"/>
-          <w:sz w:val="15"/>
-          <w:szCs w:val="15"/>
+          <w:sz w:val="18"/>
+          <w:szCs w:val="18"/>
         </w:rPr>
         <w:t xml:space="preserve">Elsinore Middle School Professional Learning Teams · 2026–27 · Meeting 8 agenda.</w:t>
       </w:r>
     </w:p>
     <w:sectPr>
       <w:pgSz w:w="12240" w:h="15840" w:orient="portrait"/>
-      <w:pgMar w:top="900" w:right="1440" w:bottom="900" w:left="1440" w:header="708" w:footer="708" w:gutter="0"/>
+      <w:pgMar w:top="864" w:right="864" w:bottom="864" w:left="864" w:header="708" w:footer="708" w:gutter="0"/>
       <w:pgNumType/>
       <w:docGrid w:linePitch="360"/>
     </w:sectPr>
   </w:body>
 </w:document>
-</file>
-
-<file path=word/comments.xml><?xml version="1.0" encoding="utf-8"?>
-<w:comments xmlns:cx="http://schemas.microsoft.com/office/drawing/2014/chartex" xmlns:cx1="http://schemas.microsoft.com/office/drawing/2015/9/8/chartex" xmlns:cx2="http://schemas.microsoft.com/office/drawing/2015/10/21/chartex" xmlns:cx3="http://schemas.microsoft.com/office/drawing/2016/5/9/chartex" xmlns:cx4="http://schemas.microsoft.com/office/drawing/2016/5/10/chartex" xmlns:cx5="http://schemas.microsoft.com/office/drawing/2016/5/11/chartex" xmlns:cx6="http://schemas.microsoft.com/office/drawing/2016/5/12/chartex" xmlns:cx7="http://schemas.microsoft.com/office/drawing/2016/5/13/chartex" xmlns:cx8="http://schemas.microsoft.com/office/drawing/2016/5/14/chartex" xmlns:mc="http://schemas.openxmlformats.org/markup-compatibility/2006" xmlns:aink="http://schemas.microsoft.com/office/drawing/2016/ink" xmlns:am3d="http://schemas.microsoft.com/office/drawing/2017/model3d" xmlns:o="urn:schemas-microsoft-com:office:office" xmlns:r="http://schemas.openxmlformats.org/officeDocument/2006/relationships" xmlns:m="http://schemas.openxmlformats.org/officeDocument/2006/math" xmlns:v="urn:schemas-microsoft-com:vml" xmlns:wp14="http://schemas.microsoft.com/office/word/2010/wordprocessingDrawing" xmlns:wp="http://schemas.openxmlformats.org/drawingml/2006/wordprocessingDrawing" xmlns:w10="urn:schemas-microsoft-com:office:word" xmlns:w="http://schemas.openxmlformats.org/wordprocessingml/2006/main" xmlns:w14="http://schemas.microsoft.com/office/word/2010/wordml" xmlns:w15="http://schemas.microsoft.com/office/word/2012/wordml" xmlns:w16cex="http://schemas.microsoft.com/office/word/2018/wordml/cex" xmlns:w16cid="http://schemas.microsoft.com/office/word/2016/wordml/cid" xmlns:w16="http://schemas.microsoft.com/office/word/2018/wordml" xmlns:w16sdtdh="http://schemas.microsoft.com/office/word/2020/wordml/sdtdatahash" xmlns:w16se="http://schemas.microsoft.com/office/word/2015/wordml/symex" xmlns:wpg="http://schemas.microsoft.com/office/word/2010/wordprocessingGroup" xmlns:wpi="http://schemas.microsoft.com/office/word/2010/wordprocessingInk" xmlns:wne="http://schemas.microsoft.com/office/word/2006/wordml" xmlns:wps="http://schemas.microsoft.com/office/word/2010/wordprocessingShape"/>
 </file>
 
 <file path=word/endnotes.xml><?xml version="1.0" encoding="utf-8"?>
@@ -946,7 +859,7 @@
 <w:numbering xmlns:wpc="http://schemas.microsoft.com/office/word/2010/wordprocessingCanvas" xmlns:mc="http://schemas.openxmlformats.org/markup-compatibility/2006" xmlns:o="urn:schemas-microsoft-com:office:office" xmlns:r="http://schemas.openxmlformats.org/officeDocument/2006/relationships" xmlns:m="http://schemas.openxmlformats.org/officeDocument/2006/math" xmlns:v="urn:schemas-microsoft-com:vml" xmlns:wp14="http://schemas.microsoft.com/office/word/2010/wordprocessingDrawing" xmlns:wp="http://schemas.openxmlformats.org/drawingml/2006/wordprocessingDrawing" xmlns:w10="urn:schemas-microsoft-com:office:word" xmlns:w="http://schemas.openxmlformats.org/wordprocessingml/2006/main" xmlns:w14="http://schemas.microsoft.com/office/word/2010/wordml" xmlns:w15="http://schemas.microsoft.com/office/word/2012/wordml" xmlns:wpg="http://schemas.microsoft.com/office/word/2010/wordprocessingGroup" xmlns:wpi="http://schemas.microsoft.com/office/word/2010/wordprocessingInk" xmlns:wne="http://schemas.microsoft.com/office/word/2006/wordml" xmlns:wps="http://schemas.microsoft.com/office/word/2010/wordprocessingShape" mc:Ignorable="w14 w15 wp14">
   <w:abstractNum w:abstractNumId="1" w15:restartNumberingAfterBreak="0">
     <w:multiLevelType w:val="hybridMultilevel"/>
-    <w:lvl w:ilvl="0" w15:tentative="1">
+    <w:lvl w:ilvl="0" w:tentative="1">
       <w:start w:val="1"/>
       <w:numFmt w:val="bullet"/>
       <w:lvlText w:val="●"/>
@@ -955,7 +868,7 @@
         <w:ind w:left="720" w:hanging="360"/>
       </w:pPr>
     </w:lvl>
-    <w:lvl w:ilvl="1" w15:tentative="1">
+    <w:lvl w:ilvl="1" w:tentative="1">
       <w:start w:val="1"/>
       <w:numFmt w:val="bullet"/>
       <w:lvlText w:val="○"/>
@@ -964,7 +877,7 @@
         <w:ind w:left="1440" w:hanging="360"/>
       </w:pPr>
     </w:lvl>
-    <w:lvl w:ilvl="2" w15:tentative="1">
+    <w:lvl w:ilvl="2" w:tentative="1">
       <w:start w:val="1"/>
       <w:numFmt w:val="bullet"/>
       <w:lvlText w:val="■"/>
@@ -973,7 +886,7 @@
         <w:ind w:left="2160" w:hanging="360"/>
       </w:pPr>
     </w:lvl>
-    <w:lvl w:ilvl="3" w15:tentative="1">
+    <w:lvl w:ilvl="3" w:tentative="1">
       <w:start w:val="1"/>
       <w:numFmt w:val="bullet"/>
       <w:lvlText w:val="●"/>
@@ -982,7 +895,7 @@
         <w:ind w:left="2880" w:hanging="360"/>
       </w:pPr>
     </w:lvl>
-    <w:lvl w:ilvl="4" w15:tentative="1">
+    <w:lvl w:ilvl="4" w:tentative="1">
       <w:start w:val="1"/>
       <w:numFmt w:val="bullet"/>
       <w:lvlText w:val="○"/>
@@ -991,7 +904,7 @@
         <w:ind w:left="3600" w:hanging="360"/>
       </w:pPr>
     </w:lvl>
-    <w:lvl w:ilvl="5" w15:tentative="1">
+    <w:lvl w:ilvl="5" w:tentative="1">
       <w:start w:val="1"/>
       <w:numFmt w:val="bullet"/>
       <w:lvlText w:val="■"/>
@@ -1000,7 +913,7 @@
         <w:ind w:left="4320" w:hanging="360"/>
       </w:pPr>
     </w:lvl>
-    <w:lvl w:ilvl="6" w15:tentative="1">
+    <w:lvl w:ilvl="6" w:tentative="1">
       <w:start w:val="1"/>
       <w:numFmt w:val="bullet"/>
       <w:lvlText w:val="●"/>
@@ -1009,7 +922,7 @@
         <w:ind w:left="5040" w:hanging="360"/>
       </w:pPr>
     </w:lvl>
-    <w:lvl w:ilvl="7" w15:tentative="1">
+    <w:lvl w:ilvl="7" w:tentative="1">
       <w:start w:val="1"/>
       <w:numFmt w:val="bullet"/>
       <w:lvlText w:val="●"/>
@@ -1018,7 +931,7 @@
         <w:ind w:left="5760" w:hanging="360"/>
       </w:pPr>
     </w:lvl>
-    <w:lvl w:ilvl="8" w15:tentative="1">
+    <w:lvl w:ilvl="8" w:tentative="1">
       <w:start w:val="1"/>
       <w:numFmt w:val="bullet"/>
       <w:lvlText w:val="●"/>
@@ -1040,14 +953,13 @@
 <file path=word/styles.xml><?xml version="1.0" encoding="utf-8"?>
 <w:styles xmlns:mc="http://schemas.openxmlformats.org/markup-compatibility/2006" xmlns:r="http://schemas.openxmlformats.org/officeDocument/2006/relationships" xmlns:w="http://schemas.openxmlformats.org/wordprocessingml/2006/main" xmlns:w14="http://schemas.microsoft.com/office/word/2010/wordml" xmlns:w15="http://schemas.microsoft.com/office/word/2012/wordml" mc:Ignorable="w14 w15">
   <w:docDefaults>
-    <w:rPrDefault>
-      <w:rPr>
-        <w:rFonts w:ascii="Calibri" w:cs="Calibri" w:eastAsia="Calibri" w:hAnsi="Calibri"/>
-        <w:color w:val="1F2933"/>
-      </w:rPr>
-    </w:rPrDefault>
+    <w:rPrDefault/>
     <w:pPrDefault/>
   </w:docDefaults>
+  <w:style w:type="paragraph" w:styleId="Normal" w:default="1">
+    <w:name w:val="Normal"/>
+    <w:qFormat/>
+  </w:style>
   <w:style w:type="paragraph" w:styleId="Title">
     <w:name w:val="Title"/>
     <w:basedOn w:val="Normal"/>
@@ -1220,4 +1132,294 @@
     </w:rPr>
   </w:style>
 </w:styles>
+</file>
+
+<file path=word/theme/theme1.xml><?xml version="1.0" encoding="utf-8"?>
+<a:theme xmlns:a="http://schemas.openxmlformats.org/drawingml/2006/main" name="Office Theme">
+  <a:themeElements>
+    <a:clrScheme name="Office">
+      <a:dk1>
+        <a:sysClr val="windowText" lastClr="000000"/>
+      </a:dk1>
+      <a:lt1>
+        <a:sysClr val="window" lastClr="FFFFFF"/>
+      </a:lt1>
+      <a:dk2>
+        <a:srgbClr val="44546A"/>
+      </a:dk2>
+      <a:lt2>
+        <a:srgbClr val="E7E6E6"/>
+      </a:lt2>
+      <a:accent1>
+        <a:srgbClr val="4472C4"/>
+      </a:accent1>
+      <a:accent2>
+        <a:srgbClr val="ED7D31"/>
+      </a:accent2>
+      <a:accent3>
+        <a:srgbClr val="A5A5A5"/>
+      </a:accent3>
+      <a:accent4>
+        <a:srgbClr val="FFC000"/>
+      </a:accent4>
+      <a:accent5>
+        <a:srgbClr val="5B9BD5"/>
+      </a:accent5>
+      <a:accent6>
+        <a:srgbClr val="70AD47"/>
+      </a:accent6>
+      <a:hlink>
+        <a:srgbClr val="0563C1"/>
+      </a:hlink>
+      <a:folHlink>
+        <a:srgbClr val="954F72"/>
+      </a:folHlink>
+    </a:clrScheme>
+    <a:fontScheme name="Office">
+      <a:majorFont>
+        <a:latin typeface="Calibri Light" panose="020F0302020204030204"/>
+        <a:ea typeface=""/>
+        <a:cs typeface=""/>
+        <a:font script="Jpan" typeface="游ゴシック Light"/>
+        <a:font script="Hang" typeface="맑은 고딕"/>
+        <a:font script="Hans" typeface="等线 Light"/>
+        <a:font script="Hant" typeface="新細明體"/>
+        <a:font script="Arab" typeface="Times New Roman"/>
+        <a:font script="Hebr" typeface="Times New Roman"/>
+        <a:font script="Thai" typeface="Angsana New"/>
+        <a:font script="Ethi" typeface="Nyala"/>
+        <a:font script="Beng" typeface="Vrinda"/>
+        <a:font script="Gujr" typeface="Shruti"/>
+        <a:font script="Khmr" typeface="MoolBoran"/>
+        <a:font script="Knda" typeface="Tunga"/>
+        <a:font script="Guru" typeface="Raavi"/>
+        <a:font script="Cans" typeface="Euphemia"/>
+        <a:font script="Cher" typeface="Plantagenet Cherokee"/>
+        <a:font script="Yiii" typeface="Microsoft Yi Baiti"/>
+        <a:font script="Tibt" typeface="Microsoft Himalaya"/>
+        <a:font script="Thaa" typeface="MV Boli"/>
+        <a:font script="Deva" typeface="Mangal"/>
+        <a:font script="Telu" typeface="Gautami"/>
+        <a:font script="Taml" typeface="Latha"/>
+        <a:font script="Syrc" typeface="Estrangelo Edessa"/>
+        <a:font script="Orya" typeface="Kalinga"/>
+        <a:font script="Mlym" typeface="Kartika"/>
+        <a:font script="Laoo" typeface="DokChampa"/>
+        <a:font script="Sinh" typeface="Iskoola Pota"/>
+        <a:font script="Mong" typeface="Mongolian Baiti"/>
+        <a:font script="Viet" typeface="Times New Roman"/>
+        <a:font script="Uigh" typeface="Microsoft Uighur"/>
+        <a:font script="Geor" typeface="Sylfaen"/>
+        <a:font script="Armn" typeface="Arial"/>
+        <a:font script="Bugi" typeface="Leelawadee UI"/>
+        <a:font script="Bopo" typeface="Microsoft JhengHei"/>
+        <a:font script="Java" typeface="Javanese Text"/>
+        <a:font script="Lisu" typeface="Segoe UI"/>
+        <a:font script="Mymr" typeface="Myanmar Text"/>
+        <a:font script="Nkoo" typeface="Ebrima"/>
+        <a:font script="Olck" typeface="Nirmala UI"/>
+        <a:font script="Osma" typeface="Ebrima"/>
+        <a:font script="Phag" typeface="Phagspa"/>
+        <a:font script="Syrn" typeface="Estrangelo Edessa"/>
+        <a:font script="Syrj" typeface="Estrangelo Edessa"/>
+        <a:font script="Syre" typeface="Estrangelo Edessa"/>
+        <a:font script="Sora" typeface="Nirmala UI"/>
+        <a:font script="Tale" typeface="Microsoft Tai Le"/>
+        <a:font script="Talu" typeface="Microsoft New Tai Lue"/>
+        <a:font script="Tfng" typeface="Ebrima"/>
+      </a:majorFont>
+      <a:minorFont>
+        <a:latin typeface="Calibri" panose="020F0502020204030204"/>
+        <a:ea typeface=""/>
+        <a:cs typeface=""/>
+        <a:font script="Jpan" typeface="游明朝"/>
+        <a:font script="Hang" typeface="맑은 고딕"/>
+        <a:font script="Hans" typeface="等线"/>
+        <a:font script="Hant" typeface="新細明體"/>
+        <a:font script="Arab" typeface="Arial"/>
+        <a:font script="Hebr" typeface="Arial"/>
+        <a:font script="Thai" typeface="Cordia New"/>
+        <a:font script="Ethi" typeface="Nyala"/>
+        <a:font script="Beng" typeface="Vrinda"/>
+        <a:font script="Gujr" typeface="Shruti"/>
+        <a:font script="Khmr" typeface="DaunPenh"/>
+        <a:font script="Knda" typeface="Tunga"/>
+        <a:font script="Guru" typeface="Raavi"/>
+        <a:font script="Cans" typeface="Euphemia"/>
+        <a:font script="Cher" typeface="Plantagenet Cherokee"/>
+        <a:font script="Yiii" typeface="Microsoft Yi Baiti"/>
+        <a:font script="Tibt" typeface="Microsoft Himalaya"/>
+        <a:font script="Thaa" typeface="MV Boli"/>
+        <a:font script="Deva" typeface="Mangal"/>
+        <a:font script="Telu" typeface="Gautami"/>
+        <a:font script="Taml" typeface="Latha"/>
+        <a:font script="Syrc" typeface="Estrangelo Edessa"/>
+        <a:font script="Orya" typeface="Kalinga"/>
+        <a:font script="Mlym" typeface="Kartika"/>
+        <a:font script="Laoo" typeface="DokChampa"/>
+        <a:font script="Sinh" typeface="Iskoola Pota"/>
+        <a:font script="Mong" typeface="Mongolian Baiti"/>
+        <a:font script="Viet" typeface="Arial"/>
+        <a:font script="Uigh" typeface="Microsoft Uighur"/>
+        <a:font script="Geor" typeface="Sylfaen"/>
+        <a:font script="Armn" typeface="Arial"/>
+        <a:font script="Bugi" typeface="Leelawadee UI"/>
+        <a:font script="Bopo" typeface="Microsoft JhengHei"/>
+        <a:font script="Java" typeface="Javanese Text"/>
+        <a:font script="Lisu" typeface="Segoe UI"/>
+        <a:font script="Mymr" typeface="Myanmar Text"/>
+        <a:font script="Nkoo" typeface="Ebrima"/>
+        <a:font script="Olck" typeface="Nirmala UI"/>
+        <a:font script="Osma" typeface="Ebrima"/>
+        <a:font script="Phag" typeface="Phagspa"/>
+        <a:font script="Syrn" typeface="Estrangelo Edessa"/>
+        <a:font script="Syrj" typeface="Estrangelo Edessa"/>
+        <a:font script="Syre" typeface="Estrangelo Edessa"/>
+        <a:font script="Sora" typeface="Nirmala UI"/>
+        <a:font script="Tale" typeface="Microsoft Tai Le"/>
+        <a:font script="Talu" typeface="Microsoft New Tai Lue"/>
+        <a:font script="Tfng" typeface="Ebrima"/>
+      </a:minorFont>
+    </a:fontScheme>
+    <a:fmtScheme name="Office">
+      <a:fillStyleLst>
+        <a:solidFill>
+          <a:schemeClr val="phClr"/>
+        </a:solidFill>
+        <a:gradFill rotWithShape="true">
+          <a:gsLst>
+            <a:gs pos="0">
+              <a:schemeClr val="phClr">
+                <a:lumMod val="110000"/>
+                <a:satMod val="105000"/>
+                <a:tint val="67000"/>
+              </a:schemeClr>
+            </a:gs>
+            <a:gs pos="50000">
+              <a:schemeClr val="phClr">
+                <a:lumMod val="105000"/>
+                <a:satMod val="103000"/>
+                <a:tint val="73000"/>
+              </a:schemeClr>
+            </a:gs>
+            <a:gs pos="100000">
+              <a:schemeClr val="phClr">
+                <a:lumMod val="105000"/>
+                <a:satMod val="109000"/>
+                <a:tint val="81000"/>
+              </a:schemeClr>
+            </a:gs>
+          </a:gsLst>
+          <a:lin ang="5400000" scaled="false"/>
+        </a:gradFill>
+        <a:gradFill rotWithShape="true">
+          <a:gsLst>
+            <a:gs pos="0">
+              <a:schemeClr val="phClr">
+                <a:satMod val="103000"/>
+                <a:lumMod val="102000"/>
+                <a:tint val="94000"/>
+              </a:schemeClr>
+            </a:gs>
+            <a:gs pos="50000">
+              <a:schemeClr val="phClr">
+                <a:satMod val="110000"/>
+                <a:lumMod val="100000"/>
+                <a:shade val="100000"/>
+              </a:schemeClr>
+            </a:gs>
+            <a:gs pos="100000">
+              <a:schemeClr val="phClr">
+                <a:lumMod val="99000"/>
+                <a:satMod val="120000"/>
+                <a:shade val="78000"/>
+              </a:schemeClr>
+            </a:gs>
+          </a:gsLst>
+          <a:lin ang="5400000" scaled="false"/>
+        </a:gradFill>
+      </a:fillStyleLst>
+      <a:lnStyleLst>
+        <a:ln w="6350" cap="flat" cmpd="sng" algn="ctr">
+          <a:solidFill>
+            <a:schemeClr val="phClr"/>
+          </a:solidFill>
+          <a:prstDash val="solid"/>
+          <a:miter lim="800000"/>
+        </a:ln>
+        <a:ln w="12700" cap="flat" cmpd="sng" algn="ctr">
+          <a:solidFill>
+            <a:schemeClr val="phClr"/>
+          </a:solidFill>
+          <a:prstDash val="solid"/>
+          <a:miter lim="800000"/>
+        </a:ln>
+        <a:ln w="19050" cap="flat" cmpd="sng" algn="ctr">
+          <a:solidFill>
+            <a:schemeClr val="phClr"/>
+          </a:solidFill>
+          <a:prstDash val="solid"/>
+          <a:miter lim="800000"/>
+        </a:ln>
+      </a:lnStyleLst>
+      <a:effectStyleLst>
+        <a:effectStyle>
+          <a:effectLst/>
+        </a:effectStyle>
+        <a:effectStyle>
+          <a:effectLst/>
+        </a:effectStyle>
+        <a:effectStyle>
+          <a:effectLst>
+            <a:outerShdw blurRad="57150" dist="19050" dir="5400000" algn="ctr" rotWithShape="false">
+              <a:srgbClr val="000000">
+                <a:alpha val="63000"/>
+              </a:srgbClr>
+            </a:outerShdw>
+          </a:effectLst>
+        </a:effectStyle>
+      </a:effectStyleLst>
+      <a:bgFillStyleLst>
+        <a:solidFill>
+          <a:schemeClr val="phClr"/>
+        </a:solidFill>
+        <a:solidFill>
+          <a:schemeClr val="phClr">
+            <a:tint val="95000"/>
+            <a:satMod val="170000"/>
+          </a:schemeClr>
+        </a:solidFill>
+        <a:gradFill rotWithShape="true">
+          <a:gsLst>
+            <a:gs pos="0">
+              <a:schemeClr val="phClr">
+                <a:tint val="93000"/>
+                <a:satMod val="150000"/>
+                <a:shade val="98000"/>
+                <a:lumMod val="102000"/>
+              </a:schemeClr>
+            </a:gs>
+            <a:gs pos="50000">
+              <a:schemeClr val="phClr">
+                <a:tint val="98000"/>
+                <a:satMod val="130000"/>
+                <a:shade val="90000"/>
+                <a:lumMod val="103000"/>
+              </a:schemeClr>
+            </a:gs>
+            <a:gs pos="100000">
+              <a:schemeClr val="phClr">
+                <a:shade val="63000"/>
+                <a:satMod val="120000"/>
+              </a:schemeClr>
+            </a:gs>
+          </a:gsLst>
+          <a:lin ang="5400000" scaled="false"/>
+        </a:gradFill>
+      </a:bgFillStyleLst>
+    </a:fmtScheme>
+  </a:themeElements>
+  <a:objectDefaults/>
+  <a:extraClrSchemeLst/>
+</a:theme>
 </file>
</xml_diff>